<commit_message>
Prepare Q1 submission snapshot
</commit_message>
<xml_diff>
--- a/manuscript/MwTW2026_Kucharski.docx
+++ b/manuscript/MwTW2026_Kucharski.docx
@@ -1257,15 +1257,11 @@
       <w:pPr>
         <w:keepNext/>
       </w:pPr>
-    </w:p>
-    <w:p>
-      <w:pPr>
-        <w:keepNext/>
-      </w:pPr>
       <w:r>
         <w:rPr>
           <w:noProof/>
         </w:rPr>
+        <w:lastRenderedPageBreak/>
         <w:drawing>
           <wp:inline distT="0" distB="0" distL="0" distR="0" wp14:anchorId="40671F7B" wp14:editId="1BA949D9">
             <wp:extent cx="6120130" cy="2706370"/>
@@ -1559,9 +1555,78 @@
         <w:jc w:val="both"/>
         <w:rPr>
           <w:rFonts w:ascii="Calibri" w:hAnsi="Calibri" w:cs="Calibri"/>
-          <w:b/>
+          <w:bCs/>
+          <w:sz w:val="16"/>
+          <w:szCs w:val="16"/>
         </w:rPr>
       </w:pPr>
+      <w:r>
+        <w:rPr>
+          <w:rFonts w:ascii="Calibri" w:hAnsi="Calibri" w:cs="Calibri"/>
+          <w:bCs/>
+          <w:sz w:val="16"/>
+          <w:szCs w:val="16"/>
+        </w:rPr>
+        <w:t>Funding: This work was supported by a grant from the Polish Ministry of</w:t>
+      </w:r>
+      <w:r>
+        <w:rPr>
+          <w:rFonts w:ascii="Calibri" w:hAnsi="Calibri" w:cs="Calibri"/>
+          <w:bCs/>
+          <w:sz w:val="16"/>
+          <w:szCs w:val="16"/>
+        </w:rPr>
+        <w:t xml:space="preserve"> </w:t>
+      </w:r>
+      <w:r>
+        <w:rPr>
+          <w:rFonts w:ascii="Calibri" w:hAnsi="Calibri" w:cs="Calibri"/>
+          <w:bCs/>
+          <w:sz w:val="16"/>
+          <w:szCs w:val="16"/>
+        </w:rPr>
+        <w:t xml:space="preserve">Science under the programme “Polish Metrology II” (Polska </w:t>
+      </w:r>
+      <w:proofErr w:type="spellStart"/>
+      <w:r>
+        <w:rPr>
+          <w:rFonts w:ascii="Calibri" w:hAnsi="Calibri" w:cs="Calibri"/>
+          <w:bCs/>
+          <w:sz w:val="16"/>
+          <w:szCs w:val="16"/>
+        </w:rPr>
+        <w:t>Metrologia</w:t>
+      </w:r>
+      <w:proofErr w:type="spellEnd"/>
+      <w:r>
+        <w:rPr>
+          <w:rFonts w:ascii="Calibri" w:hAnsi="Calibri" w:cs="Calibri"/>
+          <w:bCs/>
+          <w:sz w:val="16"/>
+          <w:szCs w:val="16"/>
+        </w:rPr>
+        <w:t xml:space="preserve"> II,</w:t>
+      </w:r>
+    </w:p>
+    <w:p>
+      <w:pPr>
+        <w:jc w:val="both"/>
+        <w:rPr>
+          <w:rFonts w:ascii="Calibri" w:hAnsi="Calibri" w:cs="Calibri"/>
+          <w:bCs/>
+          <w:sz w:val="16"/>
+          <w:szCs w:val="16"/>
+        </w:rPr>
+      </w:pPr>
+      <w:r>
+        <w:rPr>
+          <w:rFonts w:ascii="Calibri" w:hAnsi="Calibri" w:cs="Calibri"/>
+          <w:bCs/>
+          <w:sz w:val="16"/>
+          <w:szCs w:val="16"/>
+        </w:rPr>
+        <w:t>Poland), project no. PM-II/SP/0090/2024/02.</w:t>
+      </w:r>
     </w:p>
     <w:p>
       <w:pPr>
@@ -3718,7 +3783,6 @@
   <w:style w:type="character" w:default="1" w:styleId="Domylnaczcionkaakapitu">
     <w:name w:val="Default Paragraph Font"/>
     <w:uiPriority w:val="1"/>
-    <w:semiHidden/>
     <w:unhideWhenUsed/>
   </w:style>
   <w:style w:type="table" w:default="1" w:styleId="Standardowy">
@@ -4024,9 +4088,11 @@
     <w:rsid w:val="004C7269"/>
     <w:rsid w:val="005B5DF8"/>
     <w:rsid w:val="00681471"/>
+    <w:rsid w:val="00BA6E55"/>
     <w:rsid w:val="00C1308C"/>
     <w:rsid w:val="00D758DD"/>
     <w:rsid w:val="00E864DD"/>
+    <w:rsid w:val="00FD15F0"/>
   </w:rsids>
   <m:mathPr>
     <m:mathFont m:val="Cambria Math"/>
@@ -4818,53 +4884,21 @@
 </file>
 
 <file path=customXml/item1.xml><?xml version="1.0" encoding="utf-8"?>
-<?mso-contentType ?>
-<spe:Receivers xmlns:spe="http://schemas.microsoft.com/sharepoint/events">
-  <Receiver>
-    <Name>Document ID Generator</Name>
-    <Synchronization>Synchronous</Synchronization>
-    <Type>10001</Type>
-    <SequenceNumber>1000</SequenceNumber>
-    <Url/>
-    <Assembly>Microsoft.Office.DocumentManagement, Version=16.0.0.0, Culture=neutral, PublicKeyToken=71e9bce111e9429c</Assembly>
-    <Class>Microsoft.Office.DocumentManagement.Internal.DocIdHandler</Class>
-    <Data/>
-    <Filter/>
-  </Receiver>
-  <Receiver>
-    <Name>Document ID Generator</Name>
-    <Synchronization>Synchronous</Synchronization>
-    <Type>10002</Type>
-    <SequenceNumber>1001</SequenceNumber>
-    <Url/>
-    <Assembly>Microsoft.Office.DocumentManagement, Version=16.0.0.0, Culture=neutral, PublicKeyToken=71e9bce111e9429c</Assembly>
-    <Class>Microsoft.Office.DocumentManagement.Internal.DocIdHandler</Class>
-    <Data/>
-    <Filter/>
-  </Receiver>
-  <Receiver>
-    <Name>Document ID Generator</Name>
-    <Synchronization>Synchronous</Synchronization>
-    <Type>10004</Type>
-    <SequenceNumber>1002</SequenceNumber>
-    <Url/>
-    <Assembly>Microsoft.Office.DocumentManagement, Version=16.0.0.0, Culture=neutral, PublicKeyToken=71e9bce111e9429c</Assembly>
-    <Class>Microsoft.Office.DocumentManagement.Internal.DocIdHandler</Class>
-    <Data/>
-    <Filter/>
-  </Receiver>
-  <Receiver>
-    <Name>Document ID Generator</Name>
-    <Synchronization>Synchronous</Synchronization>
-    <Type>10006</Type>
-    <SequenceNumber>1003</SequenceNumber>
-    <Url/>
-    <Assembly>Microsoft.Office.DocumentManagement, Version=16.0.0.0, Culture=neutral, PublicKeyToken=71e9bce111e9429c</Assembly>
-    <Class>Microsoft.Office.DocumentManagement.Internal.DocIdHandler</Class>
-    <Data/>
-    <Filter/>
-  </Receiver>
-</spe:Receivers>
+<p:properties xmlns:p="http://schemas.microsoft.com/office/2006/metadata/properties" xmlns:xsi="http://www.w3.org/2001/XMLSchema-instance" xmlns:pc="http://schemas.microsoft.com/office/infopath/2007/PartnerControls">
+  <documentManagement>
+    <_dlc_DocId xmlns="cc35b8dc-daaa-40ca-baf2-3771e66064ca">4UYAZEKZS7P3-2021921848-118135</_dlc_DocId>
+    <_dlc_DocIdUrl xmlns="cc35b8dc-daaa-40ca-baf2-3771e66064ca">
+      <Url>https://cranfield.sharepoint.com/sites/ExecOfficeShare/_layouts/15/DocIdRedir.aspx?ID=4UYAZEKZS7P3-2021921848-118135</Url>
+      <Description>4UYAZEKZS7P3-2021921848-118135</Description>
+    </_dlc_DocIdUrl>
+    <_ip_UnifiedCompliancePolicyUIAction xmlns="http://schemas.microsoft.com/sharepoint/v3" xsi:nil="true"/>
+    <TaxCatchAll xmlns="cc35b8dc-daaa-40ca-baf2-3771e66064ca" xsi:nil="true"/>
+    <_ip_UnifiedCompliancePolicyProperties xmlns="http://schemas.microsoft.com/sharepoint/v3" xsi:nil="true"/>
+    <lcf76f155ced4ddcb4097134ff3c332f xmlns="d65b5bdd-3d83-49e7-85c1-0a6c57279201">
+      <Terms xmlns="http://schemas.microsoft.com/office/infopath/2007/PartnerControls"/>
+    </lcf76f155ced4ddcb4097134ff3c332f>
+  </documentManagement>
+</p:properties>
 </file>
 
 <file path=customXml/item2.xml><?xml version="1.0" encoding="utf-8"?>
@@ -5171,24 +5205,60 @@
 </file>
 
 <file path=customXml/item3.xml><?xml version="1.0" encoding="utf-8"?>
-<p:properties xmlns:p="http://schemas.microsoft.com/office/2006/metadata/properties" xmlns:xsi="http://www.w3.org/2001/XMLSchema-instance" xmlns:pc="http://schemas.microsoft.com/office/infopath/2007/PartnerControls">
-  <documentManagement>
-    <_dlc_DocId xmlns="cc35b8dc-daaa-40ca-baf2-3771e66064ca">4UYAZEKZS7P3-2021921848-118135</_dlc_DocId>
-    <_dlc_DocIdUrl xmlns="cc35b8dc-daaa-40ca-baf2-3771e66064ca">
-      <Url>https://cranfield.sharepoint.com/sites/ExecOfficeShare/_layouts/15/DocIdRedir.aspx?ID=4UYAZEKZS7P3-2021921848-118135</Url>
-      <Description>4UYAZEKZS7P3-2021921848-118135</Description>
-    </_dlc_DocIdUrl>
-    <_ip_UnifiedCompliancePolicyUIAction xmlns="http://schemas.microsoft.com/sharepoint/v3" xsi:nil="true"/>
-    <TaxCatchAll xmlns="cc35b8dc-daaa-40ca-baf2-3771e66064ca" xsi:nil="true"/>
-    <_ip_UnifiedCompliancePolicyProperties xmlns="http://schemas.microsoft.com/sharepoint/v3" xsi:nil="true"/>
-    <lcf76f155ced4ddcb4097134ff3c332f xmlns="d65b5bdd-3d83-49e7-85c1-0a6c57279201">
-      <Terms xmlns="http://schemas.microsoft.com/office/infopath/2007/PartnerControls"/>
-    </lcf76f155ced4ddcb4097134ff3c332f>
-  </documentManagement>
-</p:properties>
+<?mso-contentType ?>
+<spe:Receivers xmlns:spe="http://schemas.microsoft.com/sharepoint/events">
+  <Receiver>
+    <Name>Document ID Generator</Name>
+    <Synchronization>Synchronous</Synchronization>
+    <Type>10001</Type>
+    <SequenceNumber>1000</SequenceNumber>
+    <Url/>
+    <Assembly>Microsoft.Office.DocumentManagement, Version=16.0.0.0, Culture=neutral, PublicKeyToken=71e9bce111e9429c</Assembly>
+    <Class>Microsoft.Office.DocumentManagement.Internal.DocIdHandler</Class>
+    <Data/>
+    <Filter/>
+  </Receiver>
+  <Receiver>
+    <Name>Document ID Generator</Name>
+    <Synchronization>Synchronous</Synchronization>
+    <Type>10002</Type>
+    <SequenceNumber>1001</SequenceNumber>
+    <Url/>
+    <Assembly>Microsoft.Office.DocumentManagement, Version=16.0.0.0, Culture=neutral, PublicKeyToken=71e9bce111e9429c</Assembly>
+    <Class>Microsoft.Office.DocumentManagement.Internal.DocIdHandler</Class>
+    <Data/>
+    <Filter/>
+  </Receiver>
+  <Receiver>
+    <Name>Document ID Generator</Name>
+    <Synchronization>Synchronous</Synchronization>
+    <Type>10004</Type>
+    <SequenceNumber>1002</SequenceNumber>
+    <Url/>
+    <Assembly>Microsoft.Office.DocumentManagement, Version=16.0.0.0, Culture=neutral, PublicKeyToken=71e9bce111e9429c</Assembly>
+    <Class>Microsoft.Office.DocumentManagement.Internal.DocIdHandler</Class>
+    <Data/>
+    <Filter/>
+  </Receiver>
+  <Receiver>
+    <Name>Document ID Generator</Name>
+    <Synchronization>Synchronous</Synchronization>
+    <Type>10006</Type>
+    <SequenceNumber>1003</SequenceNumber>
+    <Url/>
+    <Assembly>Microsoft.Office.DocumentManagement, Version=16.0.0.0, Culture=neutral, PublicKeyToken=71e9bce111e9429c</Assembly>
+    <Class>Microsoft.Office.DocumentManagement.Internal.DocIdHandler</Class>
+    <Data/>
+    <Filter/>
+  </Receiver>
+</spe:Receivers>
 </file>
 
 <file path=customXml/item4.xml><?xml version="1.0" encoding="utf-8"?>
+<b:Sources xmlns:b="http://schemas.openxmlformats.org/officeDocument/2006/bibliography" xmlns="http://schemas.openxmlformats.org/officeDocument/2006/bibliography" SelectedStyle="\APA.XSL" StyleName="APA"/>
+</file>
+
+<file path=customXml/item5.xml><?xml version="1.0" encoding="utf-8"?>
 <?mso-contentType ?>
 <FormTemplates xmlns="http://schemas.microsoft.com/sharepoint/v3/contenttype/forms">
   <Display>DocumentLibraryForm</Display>
@@ -5197,14 +5267,14 @@
 </FormTemplates>
 </file>
 
-<file path=customXml/item5.xml><?xml version="1.0" encoding="utf-8"?>
-<b:Sources xmlns:b="http://schemas.openxmlformats.org/officeDocument/2006/bibliography" xmlns="http://schemas.openxmlformats.org/officeDocument/2006/bibliography" SelectedStyle="\APA.XSL" StyleName="APA"/>
-</file>
-
 <file path=customXml/itemProps1.xml><?xml version="1.0" encoding="utf-8"?>
-<ds:datastoreItem xmlns:ds="http://schemas.openxmlformats.org/officeDocument/2006/customXml" ds:itemID="{0C01A8C3-9D00-45D7-A6A2-5A649F641BA6}">
+<ds:datastoreItem xmlns:ds="http://schemas.openxmlformats.org/officeDocument/2006/customXml" ds:itemID="{B5D56E07-4B8C-4FD0-A046-2F8D22568052}">
   <ds:schemaRefs>
-    <ds:schemaRef ds:uri="http://schemas.microsoft.com/sharepoint/events"/>
+    <ds:schemaRef ds:uri="http://schemas.microsoft.com/office/2006/metadata/properties"/>
+    <ds:schemaRef ds:uri="http://schemas.microsoft.com/office/infopath/2007/PartnerControls"/>
+    <ds:schemaRef ds:uri="cc35b8dc-daaa-40ca-baf2-3771e66064ca"/>
+    <ds:schemaRef ds:uri="http://schemas.microsoft.com/sharepoint/v3"/>
+    <ds:schemaRef ds:uri="d65b5bdd-3d83-49e7-85c1-0a6c57279201"/>
   </ds:schemaRefs>
 </ds:datastoreItem>
 </file>
@@ -5230,29 +5300,25 @@
 </file>
 
 <file path=customXml/itemProps3.xml><?xml version="1.0" encoding="utf-8"?>
-<ds:datastoreItem xmlns:ds="http://schemas.openxmlformats.org/officeDocument/2006/customXml" ds:itemID="{B5D56E07-4B8C-4FD0-A046-2F8D22568052}">
+<ds:datastoreItem xmlns:ds="http://schemas.openxmlformats.org/officeDocument/2006/customXml" ds:itemID="{0C01A8C3-9D00-45D7-A6A2-5A649F641BA6}">
   <ds:schemaRefs>
-    <ds:schemaRef ds:uri="http://schemas.microsoft.com/office/2006/metadata/properties"/>
-    <ds:schemaRef ds:uri="http://schemas.microsoft.com/office/infopath/2007/PartnerControls"/>
-    <ds:schemaRef ds:uri="cc35b8dc-daaa-40ca-baf2-3771e66064ca"/>
-    <ds:schemaRef ds:uri="http://schemas.microsoft.com/sharepoint/v3"/>
-    <ds:schemaRef ds:uri="d65b5bdd-3d83-49e7-85c1-0a6c57279201"/>
+    <ds:schemaRef ds:uri="http://schemas.microsoft.com/sharepoint/events"/>
   </ds:schemaRefs>
 </ds:datastoreItem>
 </file>
 
 <file path=customXml/itemProps4.xml><?xml version="1.0" encoding="utf-8"?>
+<ds:datastoreItem xmlns:ds="http://schemas.openxmlformats.org/officeDocument/2006/customXml" ds:itemID="{510D6197-71BB-463D-9B48-0FF5EE23E037}">
+  <ds:schemaRefs>
+    <ds:schemaRef ds:uri="http://schemas.openxmlformats.org/officeDocument/2006/bibliography"/>
+  </ds:schemaRefs>
+</ds:datastoreItem>
+</file>
+
+<file path=customXml/itemProps5.xml><?xml version="1.0" encoding="utf-8"?>
 <ds:datastoreItem xmlns:ds="http://schemas.openxmlformats.org/officeDocument/2006/customXml" ds:itemID="{F63D9DAB-6942-4C3B-9E28-321D8875F5AE}">
   <ds:schemaRefs>
     <ds:schemaRef ds:uri="http://schemas.microsoft.com/sharepoint/v3/contenttype/forms"/>
   </ds:schemaRefs>
 </ds:datastoreItem>
-</file>
-
-<file path=customXml/itemProps5.xml><?xml version="1.0" encoding="utf-8"?>
-<ds:datastoreItem xmlns:ds="http://schemas.openxmlformats.org/officeDocument/2006/customXml" ds:itemID="{510D6197-71BB-463D-9B48-0FF5EE23E037}">
-  <ds:schemaRefs>
-    <ds:schemaRef ds:uri="http://schemas.openxmlformats.org/officeDocument/2006/bibliography"/>
-  </ds:schemaRefs>
-</ds:datastoreItem>
 </file>
</xml_diff>